<commit_message>
The peer-review day is the first class of Week 15, not 'December 1'
Dec 1 is a Tuesday: Hamilton's day. Oxford meets Nov 30 and Dec 2. Three
documents and two class pages named the Hamilton date as if it were everyone's.

Co-Authored-By: Claude Opus 5 (1M context) <noreply@anthropic.com>
</commit_message>
<xml_diff>
--- a/week-13-final-report/week-13-final-report.docx
+++ b/week-13-final-report/week-13-final-report.docx
@@ -423,7 +423,7 @@
           <w:sz w:val="22"/>
           <w:szCs w:val="22"/>
         </w:rPr>
-        <w:t xml:space="preserve">A peer, on December 1. </w:t>
+        <w:t xml:space="preserve">A peer, in Week 15. </w:t>
       </w:r>
       <w:r/>
       <w:r>
@@ -482,7 +482,7 @@
           <w:sz w:val="22"/>
           <w:szCs w:val="22"/>
         </w:rPr>
-        <w:t>December 1 is a work-and-review day: bring your draft, write, and trade a read. The reading of your evidence and the reasoning you build on it are yours; the “how AI helped you” note is where you account for any AI use.</w:t>
+        <w:t>The first class of Week 15 — Oxford Monday, November 30; Hamilton Tuesday, December 1 — is a work-and-review day: bring your draft, write, and trade a read. The reading of your evidence and the reasoning you build on it are yours; the “how AI helped you” note is where you account for any AI use.</w:t>
       </w:r>
     </w:p>
     <w:p>

</xml_diff>

<commit_message>
Final Report: the AI note sits outside the five scored parts; Week 6 work counts as evidence
The five parts sum to about 1,500–2,100 words already. The ~150-word note on
how AI helped was listed as if it were a sixth part and never scored; the
paper and the Todd-in-a-Can prompt now say it is required, unscored, and not
counted in the range.

Teaching Your Lesson sets a floor of one piece taught and one student's work
collected, which may not yield the three pieces of evidence the report asks
for. The Week 6 field-dip samples now count, as the starting point.

Co-Authored-By: Claude Opus 5 (1M context) <noreply@anthropic.com>
</commit_message>
<xml_diff>
--- a/week-13-final-report/week-13-final-report.docx
+++ b/week-13-final-report/week-13-final-report.docx
@@ -75,7 +75,7 @@
           <w:sz w:val="22"/>
           <w:szCs w:val="22"/>
         </w:rPr>
-        <w:t>The whole point of this project is to help your reader understand the guiding question that drove your field work — your planning, your teaching, and your analysis. Answer two questions, and answer both with artifacts and examples from your own work: What did you seek to learn? And what did you learn? Your paper runs about 1,500–2,100 words. The five parts carry equal weight.</w:t>
+        <w:t>The whole point of this project is to help your reader understand the guiding question that drove your field work — your planning, your teaching, and your analysis. Answer two questions, and answer both with artifacts and examples from your own work: What did you seek to learn? And what did you learn? Your paper runs about 1,500–2,100 words across five parts, which carry equal weight, plus a short note on how AI helped you.</w:t>
       </w:r>
     </w:p>
     <w:p>
@@ -104,7 +104,7 @@
           <w:sz w:val="22"/>
           <w:szCs w:val="22"/>
         </w:rPr>
-        <w:t>Cover these five parts, and name each clearly with a heading:</w:t>
+        <w:t>Cover these five parts, and name each clearly with a heading. The sixth item, the note on how AI helped you, is required but is not scored on its own:</w:t>
       </w:r>
     </w:p>
     <w:p>
@@ -176,7 +176,7 @@
           <w:sz w:val="22"/>
           <w:szCs w:val="22"/>
         </w:rPr>
-        <w:t>What you learned, shown. Present at least three telling pieces of evidence. Analyze each piece the way you've practiced all semester: explore the Depth of Knowledge the task asked for, the Ohio standard(s) it targets, how the student performed against grade level (with specific evidence), and the questions it raises about their thinking. Then synthesize across your pieces — what patterns emerge, and what does the evidence begin to suggest about your question? Land a tentative answer: say what you are now confident the evidence supports, and where it stays uncertain — an honest “I couldn’t fully answer it, and here’s why” is as strong as a confident claim. Student talk is data too: a quote, even one you reconstruct from notes or memory, is evidence. Attribute it to the pseudonym and flag reconstructions (“as I recall, Jordan said…”).</w:t>
+        <w:t>What you learned, shown. Present at least three telling pieces of evidence. The work you collected in the Week 6 field dip counts: it shows where the student started. Analyze each piece the way you've practiced all semester: explore the Depth of Knowledge the task asked for, the Ohio standard(s) it targets, how the student performed against grade level (with specific evidence), and the questions it raises about their thinking. Then synthesize across your pieces — what patterns emerge, and what does the evidence begin to suggest about your question? Land a tentative answer: say what you are now confident the evidence supports, and where it stays uncertain — an honest “I couldn’t fully answer it, and here’s why” is as strong as a confident claim. Student talk is data too: a quote, even one you reconstruct from notes or memory, is evidence. Attribute it to the pseudonym and flag reconstructions (“as I recall, Jordan said…”).</w:t>
       </w:r>
     </w:p>
     <w:p>
@@ -240,7 +240,7 @@
           <w:sz w:val="22"/>
           <w:szCs w:val="22"/>
         </w:rPr>
-        <w:t xml:space="preserve">How AI helped you (~150). </w:t>
+        <w:t xml:space="preserve">How AI helped you (~150, not counted in the 1,500–2,100). </w:t>
       </w:r>
       <w:r>
         <w:rPr>

</xml_diff>

<commit_message>
Final Report: every piece of evidence has its raw artifact in the appendix
Collected Data now asks for raw artifacts that match the figures in the
text (redacted student work, board photos, field notes as written), and
quotes come from notes, with memory reconstructions flagged. Privacy and
the rubric row follow. Week 9 day 2 previews the three things to keep.

Co-Authored-By: Claude Opus 5.5 <noreply@anthropic.com>
</commit_message>
<xml_diff>
--- a/week-13-final-report/week-13-final-report.docx
+++ b/week-13-final-report/week-13-final-report.docx
@@ -176,7 +176,7 @@
           <w:sz w:val="22"/>
           <w:szCs w:val="22"/>
         </w:rPr>
-        <w:t>What you learned, shown. Present at least three telling pieces of evidence. The work you collected in the Week 6 field dip counts: it shows where the student started. Analyze each piece the way you've practiced all semester: explore the Depth of Knowledge the task asked for, the Ohio standard(s) it targets, how the student performed against grade level (with specific evidence), and the questions it raises about their thinking. Then synthesize across your pieces — what patterns emerge, and what does the evidence begin to suggest about your question? Land a tentative answer: say what you are now confident the evidence supports, and where it stays uncertain — an honest “I couldn’t fully answer it, and here’s why” is as strong as a confident claim. Student talk is data too: a quote, even one you reconstruct from notes or memory, is evidence. Attribute it to the pseudonym and flag reconstructions (“as I recall, Jordan said…”).</w:t>
+        <w:t>What you learned, shown. Present at least three telling pieces of evidence. The work you collected in the Week 6 field dip counts: it shows where the student started. Analyze each piece the way you've practiced all semester: explore the Depth of Knowledge the task asked for, the Ohio standard(s) it targets, how the student performed against grade level (with specific evidence), and the questions it raises about their thinking. Then synthesize across your pieces. What patterns emerge, and what does the evidence begin to suggest about your question? Land a tentative answer: say what you are now confident the evidence supports, and where it stays uncertain. An honest “I couldn’t fully answer it, and here’s why” is as strong as a confident claim. Student talk is data too. Quote it from your notes, attribute it to the pseudonym, and flag anything you reconstruct from memory (“as I recall, Jordan said…”). Every piece of evidence you discuss needs its raw artifact in the appendix: a copy of the student work with names redacted, a photo of the board, or your field notes as you wrote them (an index card, a notebook page, a screenshot from your phone). Number each appendix item to match its figure in the text, so a reader can go from your claim to the original.</w:t>
       </w:r>
     </w:p>
     <w:p>
@@ -378,7 +378,7 @@
           <w:sz w:val="22"/>
           <w:szCs w:val="22"/>
         </w:rPr>
-        <w:t>Pseudonyms only. De-identify every piece of student work, in text and image, before it goes in (FERPA).</w:t>
+        <w:t>Pseudonyms only. De-identify every piece of student work and every field note, in the text and in the appendix, before it goes in (FERPA).</w:t>
       </w:r>
     </w:p>
     <w:p>
@@ -795,7 +795,7 @@
                 <w:sz w:val="22"/>
                 <w:szCs w:val="22"/>
               </w:rPr>
-              <w:t>Telling evidence — at least three pieces of student work and talk — shown and read closely along the dimensions you've practiced (Depth of Knowledge, standards, grade-level performance, the questions it raises), with claims tied to specific artifacts and pulled into tentative patterns that land a tentative answer to the question — confident where the evidence supports it, honest where it stays uncertain. What you learned, grounded in evidence.</w:t>
+              <w:t>Telling evidence — at least three pieces of student work and talk — shown and read closely along the dimensions you've practiced (Depth of Knowledge, standards, grade-level performance, the questions it raises), with claims tied to specific artifacts, each matched to its raw artifact in the appendix, and pulled into tentative patterns that land a tentative answer to the question — confident where the evidence supports it, honest where it stays uncertain. What you learned, grounded in evidence.</w:t>
             </w:r>
           </w:p>
         </w:tc>

</xml_diff>